<commit_message>
Add instructor feedback tests benchmarks and final portfolio introduction
</commit_message>
<xml_diff>
--- a/4-2 Milestone Enhancements.docx
+++ b/4-2 Milestone Enhancements.docx
@@ -160,7 +160,7 @@
         <w:ind w:firstLine="720"/>
       </w:pPr>
       <w:r>
-        <w:t>I added depth-first search to detect circular prerequisite chains. The algorithm records each vertex as unvisited, visiting, or complete; an edge leading back to a visiting vertex identifies a cycle. Because each vertex and edge is examined at most once, this validation runs in O(V + E) time. When a cycle is found, the application reports the actual chain, such as CSCI100 to CSCI200 to CSCI300 to CSCI100, instead of returning a general failure. I also implemented Kahn's topological-sort algorithm to produce a valid prerequisite-respecting sequence. The implementation uses a min-priority queue so that results remain deterministic when multiple courses are available simultaneously. A standard FIFO queue could provide O(V + E) ordering, but deterministic selection adds a logarithmic heap cost, producing an upper bound of O((V + E) log V). I accepted that trade-off because consistent output is easier to test, explain, and use.</w:t>
+        <w:t>I added depth-first search to detect circular prerequisite chains. The algorithm records each vertex as unvisited, visiting, or complete; an edge leading back to a visiting vertex identifies a cycle. The DFS traversal visits each vertex and edge at most once, taking O(V + E). The complete hasCycle method first sorts vertex identifiers, making its expected bound O(V log V + E). When a cycle is found, the application reports the actual chain, such as CSCI100 to CSCI200 to CSCI300 to CSCI100, instead of returning a general failure. I also implemented Kahn's topological-sort algorithm to produce a valid prerequisite-respecting sequence. The implementation uses a min-priority queue so that results remain deterministic when multiple courses are available simultaneously. A standard FIFO queue could provide O(V + E) ordering, but deterministic selection adds a logarithmic heap cost, giving expected O(E + V log V) time with ordinary hash-table access. I accepted that trade-off because consistent output is easier to test, explain, and use.</w:t>
       </w:r>
     </w:p>
     <w:p>
@@ -256,6 +256,49 @@
       <w:pPr>
         <w:ind w:left="720" w:hanging="720"/>
       </w:pPr>
+    </w:p>
+    <w:p>
+      <w:r>
+        <w:br w:type="page"/>
+      </w:r>
+    </w:p>
+    <w:p>
+      <w:pPr>
+        <w:pStyle w:val="Heading1"/>
+      </w:pPr>
+      <w:r>
+        <w:t>Final Performance Verification and Instructor Feedback</w:t>
+      </w:r>
+    </w:p>
+    <w:p>
+      <w:r>
+        <w:t>October 17, 2026. Professor Sanford recommended testing increasingly large and dense prerequisite graphs. In response, I added benchmarks/GraphBenchmark.cpp and a make benchmark target. Twelve generated DAG configurations cover sparse, chain, and wide graphs at 250, 1,000, and 4,000 courses, plus dense graphs at 250, 500, and 1,000 courses. Each configuration runs three times, and the retained CSV reports median milliseconds.</w:t>
+      </w:r>
+    </w:p>
+    <w:p>
+      <w:r>
+        <w:t>The benchmark checks every generated prerequisite against the output order, verifies that each course appears exactly once, requires repeated schedules to match, and validates 10,000 successful lookups per run. A separate 4,000-course graph containing a closing cycle must be rejected without leaving a partial catalog. Every configuration and the cycle check passed. The original ten regression tests also passed.</w:t>
+      </w:r>
+    </w:p>
+    <w:p>
+      <w:r>
+        <w:t>The sparse 4,000-course graph contains 11,985 edges; its median load time was 12.222 ms and median topological-order time was 0.856 ms. The dense 1,000-course graph contains 499,500 edges; its median load time was 314.401 ms and median topological-order time was 13.146 ms. Dataset generation is excluded. Load time includes parsing, validation, graph construction, and load-time cycle detection. These local synthetic measurements are descriptive evidence, not production guarantees or a statistical proof of scaling.</w:t>
+      </w:r>
+    </w:p>
+    <w:p>
+      <w:r>
+        <w:t>Source review also corrected the earlier complexity discussion. DFS traversal itself is O(V + E), but hasCycle first sorts the vertex identifiers, making the complete method expected O(V log V + E). Graph construction sorts dependent lists and therefore includes sum(d log d) work. Kahn's min-heap implementation is expected O(E + V log V), assuming ordinary hash-table behavior. Copying courses for alphabetical display also copies prerequisite vectors. The revised complexity discussion includes these implementation costs.</w:t>
+      </w:r>
+    </w:p>
+    <w:p>
+      <w:r>
+        <w:t>The ten tests passed with AddressSanitizer and UndefinedBehaviorSanitizer after disabling LeakSanitizer because the execution environment prevents its process inspection. The exact limitation is recorded in evidence/BENCHMARK_METHOD.md. This is not a claim that leak checking passed. Recursive DFS can exhaust the stack at greater depths than tested, and hash-table worst cases remain outside the timing claim.</w:t>
+      </w:r>
+    </w:p>
+    <w:p>
+      <w:r>
+        <w:t>This feedback cycle strengthened Outcome Three through measured evaluation and explicit implementation costs, Outcome Four through reproducible tooling, and Outcome Two through more precise technical reporting. I learned that a mathematically correct bound for a textbook traversal does not automatically describe the entire method surrounding it. AI acknowledgment: ChatGPT assisted with benchmark implementation, execution, analysis, and this addendum.</w:t>
+      </w:r>
     </w:p>
     <w:sectPr>
       <w:pgSz w:w="12240" w:h="15840"/>
@@ -887,7 +930,7 @@
       <w:rFonts w:asciiTheme="majorHAnsi" w:eastAsiaTheme="majorEastAsia" w:hAnsiTheme="majorHAnsi" w:cstheme="majorBidi"/>
       <w:b/>
       <w:bCs/>
-      <w:color w:val="365F91" w:themeColor="accent1" w:themeShade="BF"/>
+      <w:color w:val="000000"/>
       <w:sz w:val="28"/>
       <w:szCs w:val="28"/>
     </w:rPr>
@@ -911,7 +954,7 @@
       <w:rFonts w:asciiTheme="majorHAnsi" w:eastAsiaTheme="majorEastAsia" w:hAnsiTheme="majorHAnsi" w:cstheme="majorBidi"/>
       <w:b/>
       <w:bCs/>
-      <w:color w:val="4F81BD" w:themeColor="accent1"/>
+      <w:color w:val="000000"/>
       <w:sz w:val="26"/>
       <w:szCs w:val="26"/>
     </w:rPr>
@@ -935,7 +978,7 @@
       <w:rFonts w:asciiTheme="majorHAnsi" w:eastAsiaTheme="majorEastAsia" w:hAnsiTheme="majorHAnsi" w:cstheme="majorBidi"/>
       <w:b/>
       <w:bCs/>
-      <w:color w:val="4F81BD" w:themeColor="accent1"/>
+      <w:color w:val="000000"/>
     </w:rPr>
   </w:style>
   <w:style w:type="paragraph" w:styleId="Heading4">
@@ -960,7 +1003,7 @@
       <w:bCs/>
       <w:i/>
       <w:iCs/>
-      <w:color w:val="4F81BD" w:themeColor="accent1"/>
+      <w:color w:val="000000"/>
     </w:rPr>
   </w:style>
   <w:style w:type="paragraph" w:styleId="Heading5">
@@ -981,7 +1024,7 @@
     </w:pPr>
     <w:rPr>
       <w:rFonts w:asciiTheme="majorHAnsi" w:eastAsiaTheme="majorEastAsia" w:hAnsiTheme="majorHAnsi" w:cstheme="majorBidi"/>
-      <w:color w:val="243F60" w:themeColor="accent1" w:themeShade="7F"/>
+      <w:color w:val="000000"/>
     </w:rPr>
   </w:style>
   <w:style w:type="paragraph" w:styleId="Heading6">
@@ -1004,7 +1047,7 @@
       <w:rFonts w:asciiTheme="majorHAnsi" w:eastAsiaTheme="majorEastAsia" w:hAnsiTheme="majorHAnsi" w:cstheme="majorBidi"/>
       <w:i/>
       <w:iCs/>
-      <w:color w:val="243F60" w:themeColor="accent1" w:themeShade="7F"/>
+      <w:color w:val="000000"/>
     </w:rPr>
   </w:style>
   <w:style w:type="paragraph" w:styleId="Heading7">
@@ -1027,7 +1070,7 @@
       <w:rFonts w:asciiTheme="majorHAnsi" w:eastAsiaTheme="majorEastAsia" w:hAnsiTheme="majorHAnsi" w:cstheme="majorBidi"/>
       <w:i/>
       <w:iCs/>
-      <w:color w:val="404040" w:themeColor="text1" w:themeTint="BF"/>
+      <w:color w:val="000000"/>
     </w:rPr>
   </w:style>
   <w:style w:type="paragraph" w:styleId="Heading8">
@@ -1048,7 +1091,7 @@
     </w:pPr>
     <w:rPr>
       <w:rFonts w:asciiTheme="majorHAnsi" w:eastAsiaTheme="majorEastAsia" w:hAnsiTheme="majorHAnsi" w:cstheme="majorBidi"/>
-      <w:color w:val="4F81BD" w:themeColor="accent1"/>
+      <w:color w:val="000000"/>
       <w:sz w:val="20"/>
       <w:szCs w:val="20"/>
     </w:rPr>
@@ -1073,7 +1116,7 @@
       <w:rFonts w:asciiTheme="majorHAnsi" w:eastAsiaTheme="majorEastAsia" w:hAnsiTheme="majorHAnsi" w:cstheme="majorBidi"/>
       <w:i/>
       <w:iCs/>
-      <w:color w:val="404040" w:themeColor="text1" w:themeTint="BF"/>
+      <w:color w:val="000000"/>
       <w:sz w:val="20"/>
       <w:szCs w:val="20"/>
     </w:rPr>
@@ -1210,15 +1253,12 @@
     <w:qFormat/>
     <w:rsid w:val="00FC693F"/>
     <w:pPr>
-      <w:pBdr>
-        <w:bottom w:val="single" w:sz="8" w:space="4" w:color="4F81BD" w:themeColor="accent1"/>
-      </w:pBdr>
       <w:spacing w:after="300" w:line="240" w:lineRule="auto"/>
       <w:contextualSpacing/>
     </w:pPr>
     <w:rPr>
       <w:rFonts w:asciiTheme="majorHAnsi" w:eastAsiaTheme="majorEastAsia" w:hAnsiTheme="majorHAnsi" w:cstheme="majorBidi"/>
-      <w:color w:val="17365D" w:themeColor="text2" w:themeShade="BF"/>
+      <w:color w:val="000000"/>
       <w:spacing w:val="5"/>
       <w:kern w:val="28"/>
       <w:sz w:val="52"/>
@@ -1257,7 +1297,7 @@
       <w:rFonts w:asciiTheme="majorHAnsi" w:eastAsiaTheme="majorEastAsia" w:hAnsiTheme="majorHAnsi" w:cstheme="majorBidi"/>
       <w:i/>
       <w:iCs/>
-      <w:color w:val="4F81BD" w:themeColor="accent1"/>
+      <w:color w:val="000000"/>
       <w:spacing w:val="15"/>
       <w:szCs w:val="24"/>
     </w:rPr>
@@ -1696,9 +1736,6 @@
     <w:qFormat/>
     <w:rsid w:val="00FC693F"/>
     <w:pPr>
-      <w:pBdr>
-        <w:bottom w:val="single" w:sz="4" w:space="4" w:color="4F81BD" w:themeColor="accent1"/>
-      </w:pBdr>
       <w:spacing w:before="200" w:after="280"/>
       <w:ind w:left="936" w:right="936"/>
     </w:pPr>

</xml_diff>